<commit_message>
feat: tambahkan 4 template bukti dukung Word & Excel untuk Indikator 12 dan posisikan di bawah card Matriks Kriteria Level Kematangan
</commit_message>
<xml_diff>
--- a/public/templates/ind_12/Template_SK_Tim_CSIRT_dan_Profil_RFC2350_Indikator12.docx
+++ b/public/templates/ind_12/Template_SK_Tim_CSIRT_dan_Profil_RFC2350_Indikator12.docx
@@ -11,7 +11,7 @@
           <w:b/>
           <w:sz w:val="24"/>
         </w:rPr>
-        <w:t>PEMERINTAH KABUPATEN / KOTA / PROVINSI [NAMA DAERAH]</w:t>
+        <w:t>PEMERINTAH DAERAH / KEMENTERIAN / LEMBAGA [NAMA INSTANSI]</w:t>
         <w:br/>
       </w:r>
       <w:r>
@@ -19,7 +19,7 @@
           <w:b/>
           <w:sz w:val="26"/>
         </w:rPr>
-        <w:t>TIM KOORDINASI PEMERINTAH DIGITAL / ASPEK 4: KEAMANAN PEMERINTAH DIGITAL</w:t>
+        <w:t>DINAS KOMUNIKASI DAN INFORMATIKA / PUSAT DATA DAN INFORMASI</w:t>
         <w:br/>
       </w:r>
       <w:r>
@@ -27,7 +27,7 @@
           <w:color w:val="646464"/>
           <w:sz w:val="18"/>
         </w:rPr>
-        <w:t>Jalan Praja Mandiri No. 01, Telp: (021) 7890123, Email: kominfo@daerah.go.id</w:t>
+        <w:t>Jalan Merdeka Siber No. 1, Telp: (021) 8888-CSIRT, Email: csirt@daerah.go.id, Web: https://csirt.daerah.go.id</w:t>
         <w:br/>
       </w:r>
     </w:p>
@@ -44,116 +44,27 @@
     </w:p>
     <w:p>
       <w:pPr>
+        <w:pStyle w:val="Heading1"/>
         <w:jc w:val="center"/>
       </w:pPr>
       <w:r>
         <w:rPr>
           <w:b/>
-          <w:sz w:val="26"/>
+          <w:color w:val="1F4E79"/>
+          <w:sz w:val="24"/>
         </w:rPr>
-        <w:t>SURAT KEPUTUS KEPALA DAERAH TENTANG TIM TANGGAP INSIDEN SIBER (CSIRT) &amp; DOKUMEN PROFIL RFC 2350</w:t>
+        <w:t>KEPUTUSAN KEPALA DAERAH / PIMPINAN INSTANSI</w:t>
         <w:br/>
-      </w:r>
-      <w:r>
-        <w:rPr>
-          <w:b/>
-          <w:sz w:val="22"/>
-        </w:rPr>
-        <w:t>SK/CSIRT-DAERAH/2026/012</w:t>
+        <w:t>NOMOR: 188.45/120/CSIRT/2026</w:t>
         <w:br/>
         <w:br/>
+        <w:t>TENTANG</w:t>
+        <w:br/>
+        <w:t>PEMBENTUKAN TIM TANGGAP INSIDEN SIBER (COMPUTER SECURITY INCIDENT RESPONSE TEAM / CSIRT)</w:t>
+        <w:br/>
+        <w:t>PEMERINTAH [NAMA INSTANSI]</w:t>
       </w:r>
     </w:p>
-    <w:tbl>
-      <w:tblPr>
-        <w:tblW w:type="auto" w:w="0"/>
-        <w:jc w:val="center"/>
-        <w:tblLayout w:type="fixed"/>
-        <w:tblLook w:firstColumn="1" w:firstRow="1" w:lastColumn="0" w:lastRow="0" w:noHBand="0" w:noVBand="1" w:val="04A0"/>
-      </w:tblPr>
-      <w:tblGrid>
-        <w:gridCol w:w="4680"/>
-        <w:gridCol w:w="4680"/>
-      </w:tblGrid>
-      <w:tr>
-        <w:tc>
-          <w:tcPr>
-            <w:tcW w:type="dxa" w:w="4680"/>
-            <w:shd w:fill="F1F5F9"/>
-            <w:tcMar>
-              <w:top w:w="80" w:type="dxa"/>
-              <w:bottom w:w="80" w:type="dxa"/>
-              <w:left w:w="120" w:type="dxa"/>
-              <w:right w:w="120" w:type="dxa"/>
-            </w:tcMar>
-          </w:tcPr>
-          <w:p>
-            <w:r>
-              <w:rPr>
-                <w:b/>
-              </w:rPr>
-              <w:t>Kode Indikator Evaluasi</w:t>
-            </w:r>
-          </w:p>
-        </w:tc>
-        <w:tc>
-          <w:tcPr>
-            <w:tcW w:type="dxa" w:w="4680"/>
-            <w:shd w:fill="F1F5F9"/>
-            <w:tcMar>
-              <w:top w:w="80" w:type="dxa"/>
-              <w:bottom w:w="80" w:type="dxa"/>
-              <w:left w:w="120" w:type="dxa"/>
-              <w:right w:w="120" w:type="dxa"/>
-            </w:tcMar>
-          </w:tcPr>
-          <w:p>
-            <w:r>
-              <w:t>IND-12 - Tanggap Insiden Siber (CSIRT)</w:t>
-            </w:r>
-          </w:p>
-        </w:tc>
-      </w:tr>
-      <w:tr>
-        <w:tc>
-          <w:tcPr>
-            <w:tcW w:type="dxa" w:w="4680"/>
-            <w:shd w:fill="F1F5F9"/>
-            <w:tcMar>
-              <w:top w:w="80" w:type="dxa"/>
-              <w:bottom w:w="80" w:type="dxa"/>
-              <w:left w:w="120" w:type="dxa"/>
-              <w:right w:w="120" w:type="dxa"/>
-            </w:tcMar>
-          </w:tcPr>
-          <w:p>
-            <w:r>
-              <w:rPr>
-                <w:b/>
-              </w:rPr>
-              <w:t>Aspek &amp; Regulasi Rujukan</w:t>
-            </w:r>
-          </w:p>
-        </w:tc>
-        <w:tc>
-          <w:tcPr>
-            <w:tcW w:type="dxa" w:w="4680"/>
-            <w:shd w:fill="F1F5F9"/>
-            <w:tcMar>
-              <w:top w:w="80" w:type="dxa"/>
-              <w:bottom w:w="80" w:type="dxa"/>
-              <w:left w:w="120" w:type="dxa"/>
-              <w:right w:w="120" w:type="dxa"/>
-            </w:tcMar>
-          </w:tcPr>
-          <w:p>
-            <w:r>
-              <w:t>Aspek 4: Keamanan Pemerintah Digital (PermenPANRB No. 8 Tahun 2026)</w:t>
-            </w:r>
-          </w:p>
-        </w:tc>
-      </w:tr>
-    </w:tbl>
     <w:p>
       <w:r>
         <w:br/>
@@ -163,63 +74,108 @@
       <w:r>
         <w:rPr>
           <w:b/>
-          <w:color w:val="1E3A8A"/>
-          <w:sz w:val="22"/>
         </w:rPr>
-        <w:t>1. PEMBENTUKAN DAN SUSUNAN TIM CSIRT</w:t>
+        <w:t>MENIMBANG:</w:t>
+        <w:br/>
       </w:r>
-    </w:p>
-    <w:p>
-      <w:pPr>
-        <w:spacing w:line="276" w:lineRule="auto" w:after="120"/>
-      </w:pPr>
       <w:r>
-        <w:rPr>
-          <w:sz w:val="21"/>
-        </w:rPr>
-        <w:t>Pembina: Sekretaris Daerah; Ketua Tim: Kepala Diskominfo; Tim Triase &amp; Analis: Pranata Komputer Madya/Muda; Tim Penanganan: Ahli Jaringan &amp; Web.</w:t>
+        <w:t>a. bahwa untuk menjamin keamanan informasi, kelangsungan penyelenggaraan sistem elektronik, dan ketahanan data strategis pemerintah dari ancaman dan serangan siber;</w:t>
+        <w:br/>
+        <w:t>b. bahwa berdasarkan Peraturan Badan Siber dan Sandi Negara Nomor 10 Tahun 2020 tentang Tim Tanggap Insiden Siber, perlu dibentuk Tim Tanggap Insiden Siber (CSIRT) pada instansi pemerintah;</w:t>
+        <w:br/>
+        <w:t>c. bahwa untuk pemenuhan Indikator 12 Evaluasi Kinerja Pemerintahan Digital PermenPANRB Nomor 8 Tahun 2026, diperlukan kelembagaan resmi penanganan insiden siber yang terdaftar di BSSN;</w:t>
+        <w:br/>
+        <w:t>d. bahwa berdasarkan pertimbangan sebagaimana dimaksud pada huruf a, b, dan c, perlu menetapkan Keputusan Kepala Instansi tentang Pembentukan Tim CSIRT.</w:t>
       </w:r>
     </w:p>
     <w:p>
       <w:r>
         <w:rPr>
           <w:b/>
-          <w:color w:val="1E3A8A"/>
-          <w:sz w:val="22"/>
         </w:rPr>
-        <w:t>2. PROFIL RESMI CSIRT (RFC 2350)</w:t>
+        <w:t>MENGINGAT:</w:t>
+        <w:br/>
+      </w:r>
+      <w:r>
+        <w:t>1. Undang-Undang Nomor 1 Tahun 2024 tentang Perubahan Kedua atas UU No. 11/2008 tentang Informasi dan Transaksi Elektronik;</w:t>
+        <w:br/>
+        <w:t>2. Undang-Undang Nomor 27 Tahun 2022 tentang Pelindungan Data Pribadi (UU PDP);</w:t>
+        <w:br/>
+        <w:t>3. Peraturan Presiden Nomor 95 Tahun 2018 tentang Sistem Pemerintahan Berbasis Elektronik (SPBE);</w:t>
+        <w:br/>
+        <w:t>4. Peraturan Presiden Nomor 82 Tahun 2022 tentang Pelindungan Infrastruktur Informasi Vital;</w:t>
+        <w:br/>
+        <w:t>5. Peraturan BSSN Nomor 10 Tahun 2020 tentang Tim Tanggap Insiden Siber;</w:t>
+        <w:br/>
+        <w:t>6. Peraturan Menteri PANRB Nomor 8 Tahun 2026 tentang Evaluasi Kinerja Pemerintahan Digital (Indikator 12: Penanganan Insiden Siber).</w:t>
       </w:r>
     </w:p>
     <w:p>
       <w:pPr>
-        <w:spacing w:line="276" w:lineRule="auto" w:after="120"/>
+        <w:pStyle w:val="Heading2"/>
+        <w:jc w:val="center"/>
       </w:pPr>
       <w:r>
         <w:rPr>
-          <w:sz w:val="21"/>
+          <w:color w:val="1F4E79"/>
         </w:rPr>
-        <w:t>Mendefinisikan alamat PGP Key resmi tim CSIRT, jam operasional 24/7, email aduan insiden siber resmi (csirt@daerah.go.id), dan ruang lingkup konstituen seluruh OPD.</w:t>
+        <w:t>MEMUTUSKAN:</w:t>
       </w:r>
     </w:p>
     <w:p>
       <w:r>
         <w:rPr>
           <w:b/>
-          <w:color w:val="1E3A8A"/>
-          <w:sz w:val="22"/>
         </w:rPr>
-        <w:t>3. MATRIKS ESKALASI DAN KOMUNIKASI PUBLIK</w:t>
+        <w:t xml:space="preserve">KESATU: </w:t>
       </w:r>
-    </w:p>
-    <w:p>
-      <w:pPr>
-        <w:spacing w:line="276" w:lineRule="auto" w:after="120"/>
-      </w:pPr>
+      <w:r>
+        <w:t>Membentuk Tim Tanggap Insiden Siber (Computer Security Incident Response Team / CSIRT) Instansi dengan nama resmi [NAMA INSTANSI]-CSIRT.</w:t>
+        <w:br/>
+        <w:br/>
+      </w:r>
       <w:r>
         <w:rPr>
-          <w:sz w:val="21"/>
+          <w:b/>
         </w:rPr>
-        <w:t>Prosedur isolasi sistem terdampak, eskalasi darurat ke BSSN (Pusopskamsinas), dan penerbitan Security Advisory resmi untuk mitigasi masal.</w:t>
+        <w:t xml:space="preserve">KEDUA: </w:t>
+      </w:r>
+      <w:r>
+        <w:t>Susunan keanggotaan dan uraian tugas [NAMA INSTANSI]-CSIRT tercantum dalam Lampiran I yang merupakan bagian tidak terpisahkan dari Keputusan ini.</w:t>
+        <w:br/>
+        <w:br/>
+      </w:r>
+      <w:r>
+        <w:rPr>
+          <w:b/>
+        </w:rPr>
+        <w:t xml:space="preserve">KETIGA: </w:t>
+      </w:r>
+      <w:r>
+        <w:t>Menetapkan Dokumen Profil CSIRT mengacu pada standar internasional RFC 2350 (Expectations for Computer Security Incident Response) sebagaimana tercantum dalam Lampiran II Keputusan ini.</w:t>
+        <w:br/>
+        <w:br/>
+      </w:r>
+      <w:r>
+        <w:rPr>
+          <w:b/>
+        </w:rPr>
+        <w:t xml:space="preserve">KEEMPAT: </w:t>
+      </w:r>
+      <w:r>
+        <w:t>Dalam melaksanakan tugasnya, Tim CSIRT bertanggung jawab kepada Kepala Instansi melalui Kepala Dinas Komunikasi dan Informatika / Pejabat yang membidangi TIK dan berkoordinasi secara teknis dengan Pusat Operasi Keamanan Siber Nasional Badan Siber dan Sandi Negara (Gov-CSIRT BSSN).</w:t>
+        <w:br/>
+        <w:br/>
+      </w:r>
+      <w:r>
+        <w:rPr>
+          <w:b/>
+        </w:rPr>
+        <w:t xml:space="preserve">KELIMA: </w:t>
+      </w:r>
+      <w:r>
+        <w:t>Keputusan ini mulai berlaku pada tanggal ditetapkan dengan ketentuan apabila di kemudian hari terdapat kekeliruan akan diadakan perbaikan sebagaimana mestinya.</w:t>
+        <w:br/>
       </w:r>
     </w:p>
     <w:p>
@@ -237,22 +193,15 @@
         </w:rPr>
         <w:t>Ditetapkan di: [Nama Kota]</w:t>
         <w:br/>
-        <w:t>Pada tanggal: 10 Maret 2026</w:t>
+        <w:t>Pada tanggal: 05 Januari 2026</w:t>
         <w:br/>
         <w:br/>
       </w:r>
-    </w:p>
-    <w:p>
-      <w:pPr>
-        <w:jc w:val="right"/>
-      </w:pPr>
       <w:r>
         <w:rPr>
           <w:b/>
-          <w:sz w:val="20"/>
         </w:rPr>
-        <w:t>KEPALA DINAS KOMUNIKASI DAN INFORMATIKA</w:t>
-        <w:br/>
+        <w:t>KEPALA DAERAH / PIMPINAN INSTANSI,</w:t>
         <w:br/>
         <w:br/>
         <w:br/>
@@ -261,17 +210,492 @@
       <w:r>
         <w:rPr>
           <w:b/>
-          <w:sz w:val="20"/>
         </w:rPr>
-        <w:t>[NAMA PEJABAT LENGKAP, GELAR]</w:t>
+        <w:t>[NAMA LENGKAP PIMPINAN]</w:t>
+        <w:br/>
+        <w:t>NIP. 19750810 199803 1 002</w:t>
         <w:br/>
       </w:r>
       <w:r>
+        <w:t>(Ditandatangani secara elektronik bersertifikat BSrE)</w:t>
+      </w:r>
+    </w:p>
+    <w:p>
+      <w:r>
+        <w:br w:type="page"/>
+      </w:r>
+    </w:p>
+    <w:p>
+      <w:pPr>
+        <w:pStyle w:val="Heading2"/>
+      </w:pPr>
+      <w:r>
         <w:rPr>
-          <w:sz w:val="18"/>
+          <w:color w:val="1F4E79"/>
         </w:rPr>
-        <w:t>NIP. 19800101 200501 1 001</w:t>
+        <w:t>LAMPIRAN I: STRUKTUR ORGANISASI DAN URAIAN TUGAS TIM CSIRT</w:t>
+      </w:r>
+    </w:p>
+    <w:tbl>
+      <w:tblPr>
+        <w:tblW w:type="auto" w:w="0"/>
+        <w:jc w:val="center"/>
+        <w:tblLook w:firstColumn="1" w:firstRow="1" w:lastColumn="0" w:lastRow="0" w:noHBand="0" w:noVBand="1" w:val="04A0"/>
+      </w:tblPr>
+      <w:tblGrid>
+        <w:gridCol w:w="3120"/>
+        <w:gridCol w:w="3120"/>
+        <w:gridCol w:w="3120"/>
+      </w:tblGrid>
+      <w:tr>
+        <w:tc>
+          <w:tcPr>
+            <w:tcW w:type="dxa" w:w="720"/>
+            <w:shd w:fill="1F4E79"/>
+          </w:tcPr>
+          <w:p>
+            <w:r>
+              <w:rPr>
+                <w:b/>
+                <w:color w:val="FFFFFF"/>
+              </w:rPr>
+              <w:t>No</w:t>
+            </w:r>
+          </w:p>
+        </w:tc>
+        <w:tc>
+          <w:tcPr>
+            <w:tcW w:type="dxa" w:w="3168"/>
+            <w:shd w:fill="1F4E79"/>
+          </w:tcPr>
+          <w:p>
+            <w:r>
+              <w:rPr>
+                <w:b/>
+                <w:color w:val="FFFFFF"/>
+              </w:rPr>
+              <w:t>Jabatan dalam Tim CSIRT</w:t>
+            </w:r>
+          </w:p>
+        </w:tc>
+        <w:tc>
+          <w:tcPr>
+            <w:tcW w:type="dxa" w:w="5472"/>
+            <w:shd w:fill="1F4E79"/>
+          </w:tcPr>
+          <w:p>
+            <w:r>
+              <w:rPr>
+                <w:b/>
+                <w:color w:val="FFFFFF"/>
+              </w:rPr>
+              <w:t>Uraian Tugas dan Tanggung Jawab Operasional</w:t>
+            </w:r>
+          </w:p>
+        </w:tc>
+      </w:tr>
+      <w:tr>
+        <w:tc>
+          <w:tcPr>
+            <w:tcW w:type="dxa" w:w="3120"/>
+            <w:tcMar>
+              <w:top w:w="60" w:type="dxa"/>
+              <w:bottom w:w="60" w:type="dxa"/>
+              <w:left w:w="80" w:type="dxa"/>
+              <w:right w:w="80" w:type="dxa"/>
+            </w:tcMar>
+          </w:tcPr>
+          <w:p>
+            <w:r>
+              <w:t>1</w:t>
+            </w:r>
+          </w:p>
+        </w:tc>
+        <w:tc>
+          <w:tcPr>
+            <w:tcW w:type="dxa" w:w="3120"/>
+            <w:tcMar>
+              <w:top w:w="60" w:type="dxa"/>
+              <w:bottom w:w="60" w:type="dxa"/>
+              <w:left w:w="80" w:type="dxa"/>
+              <w:right w:w="80" w:type="dxa"/>
+            </w:tcMar>
+          </w:tcPr>
+          <w:p>
+            <w:r>
+              <w:rPr>
+                <w:b/>
+              </w:rPr>
+              <w:t>Pengarah (Steering Committee)</w:t>
+            </w:r>
+          </w:p>
+        </w:tc>
+        <w:tc>
+          <w:tcPr>
+            <w:tcW w:type="dxa" w:w="3120"/>
+            <w:tcMar>
+              <w:top w:w="60" w:type="dxa"/>
+              <w:bottom w:w="60" w:type="dxa"/>
+              <w:left w:w="80" w:type="dxa"/>
+              <w:right w:w="80" w:type="dxa"/>
+            </w:tcMar>
+          </w:tcPr>
+          <w:p>
+            <w:r>
+              <w:t>Memberikan arahan strategis, kebijakan alokasi anggaran, otorisasi deklarasi keadaan darurat siber instansi, dan persetujuan penghentian sementara layanan publik terdampak kritis.</w:t>
+            </w:r>
+          </w:p>
+        </w:tc>
+      </w:tr>
+      <w:tr>
+        <w:tc>
+          <w:tcPr>
+            <w:tcW w:type="dxa" w:w="3120"/>
+            <w:tcMar>
+              <w:top w:w="60" w:type="dxa"/>
+              <w:bottom w:w="60" w:type="dxa"/>
+              <w:left w:w="80" w:type="dxa"/>
+              <w:right w:w="80" w:type="dxa"/>
+            </w:tcMar>
+            <w:shd w:fill="F9FAFB"/>
+          </w:tcPr>
+          <w:p>
+            <w:r>
+              <w:t>2</w:t>
+            </w:r>
+          </w:p>
+        </w:tc>
+        <w:tc>
+          <w:tcPr>
+            <w:tcW w:type="dxa" w:w="3120"/>
+            <w:tcMar>
+              <w:top w:w="60" w:type="dxa"/>
+              <w:bottom w:w="60" w:type="dxa"/>
+              <w:left w:w="80" w:type="dxa"/>
+              <w:right w:w="80" w:type="dxa"/>
+            </w:tcMar>
+            <w:shd w:fill="F9FAFB"/>
+          </w:tcPr>
+          <w:p>
+            <w:r>
+              <w:rPr>
+                <w:b/>
+              </w:rPr>
+              <w:t>Ketua CSIRT (Incident Commander)</w:t>
+            </w:r>
+          </w:p>
+        </w:tc>
+        <w:tc>
+          <w:tcPr>
+            <w:tcW w:type="dxa" w:w="3120"/>
+            <w:tcMar>
+              <w:top w:w="60" w:type="dxa"/>
+              <w:bottom w:w="60" w:type="dxa"/>
+              <w:left w:w="80" w:type="dxa"/>
+              <w:right w:w="80" w:type="dxa"/>
+            </w:tcMar>
+            <w:shd w:fill="F9FAFB"/>
+          </w:tcPr>
+          <w:p>
+            <w:r>
+              <w:t>Memimpin seluruh koordinasi operasional respon tanggap insiden, menjalin hubungan eskalasi dengan BSSN dan aparat penegak hukum, serta menyetujui laporan akhir investigasi insiden.</w:t>
+            </w:r>
+          </w:p>
+        </w:tc>
+      </w:tr>
+      <w:tr>
+        <w:tc>
+          <w:tcPr>
+            <w:tcW w:type="dxa" w:w="3120"/>
+            <w:tcMar>
+              <w:top w:w="60" w:type="dxa"/>
+              <w:bottom w:w="60" w:type="dxa"/>
+              <w:left w:w="80" w:type="dxa"/>
+              <w:right w:w="80" w:type="dxa"/>
+            </w:tcMar>
+          </w:tcPr>
+          <w:p>
+            <w:r>
+              <w:t>3</w:t>
+            </w:r>
+          </w:p>
+        </w:tc>
+        <w:tc>
+          <w:tcPr>
+            <w:tcW w:type="dxa" w:w="3120"/>
+            <w:tcMar>
+              <w:top w:w="60" w:type="dxa"/>
+              <w:bottom w:w="60" w:type="dxa"/>
+              <w:left w:w="80" w:type="dxa"/>
+              <w:right w:w="80" w:type="dxa"/>
+            </w:tcMar>
+          </w:tcPr>
+          <w:p>
+            <w:r>
+              <w:rPr>
+                <w:b/>
+              </w:rPr>
+              <w:t>Koordinator Triase &amp; Helpdesk Aduan</w:t>
+            </w:r>
+          </w:p>
+        </w:tc>
+        <w:tc>
+          <w:tcPr>
+            <w:tcW w:type="dxa" w:w="3120"/>
+            <w:tcMar>
+              <w:top w:w="60" w:type="dxa"/>
+              <w:bottom w:w="60" w:type="dxa"/>
+              <w:left w:w="80" w:type="dxa"/>
+              <w:right w:w="80" w:type="dxa"/>
+            </w:tcMar>
+          </w:tcPr>
+          <w:p>
+            <w:r>
+              <w:t>Menerima laporan aduan insiden siber dari kanal resmi (web, email, hotline 24/7), memverifikasi keabsahan laporan, mengkategorikan tingkat keparahan, dan mendistribusikan tiket penanganan.</w:t>
+            </w:r>
+          </w:p>
+        </w:tc>
+      </w:tr>
+      <w:tr>
+        <w:tc>
+          <w:tcPr>
+            <w:tcW w:type="dxa" w:w="3120"/>
+            <w:tcMar>
+              <w:top w:w="60" w:type="dxa"/>
+              <w:bottom w:w="60" w:type="dxa"/>
+              <w:left w:w="80" w:type="dxa"/>
+              <w:right w:w="80" w:type="dxa"/>
+            </w:tcMar>
+            <w:shd w:fill="F9FAFB"/>
+          </w:tcPr>
+          <w:p>
+            <w:r>
+              <w:t>4</w:t>
+            </w:r>
+          </w:p>
+        </w:tc>
+        <w:tc>
+          <w:tcPr>
+            <w:tcW w:type="dxa" w:w="3120"/>
+            <w:tcMar>
+              <w:top w:w="60" w:type="dxa"/>
+              <w:bottom w:w="60" w:type="dxa"/>
+              <w:left w:w="80" w:type="dxa"/>
+              <w:right w:w="80" w:type="dxa"/>
+            </w:tcMar>
+            <w:shd w:fill="F9FAFB"/>
+          </w:tcPr>
+          <w:p>
+            <w:r>
+              <w:rPr>
+                <w:b/>
+              </w:rPr>
+              <w:t>Analis Forensik &amp; Malware</w:t>
+            </w:r>
+          </w:p>
+        </w:tc>
+        <w:tc>
+          <w:tcPr>
+            <w:tcW w:type="dxa" w:w="3120"/>
+            <w:tcMar>
+              <w:top w:w="60" w:type="dxa"/>
+              <w:bottom w:w="60" w:type="dxa"/>
+              <w:left w:w="80" w:type="dxa"/>
+              <w:right w:w="80" w:type="dxa"/>
+            </w:tcMar>
+            <w:shd w:fill="F9FAFB"/>
+          </w:tcPr>
+          <w:p>
+            <w:r>
+              <w:t>Melakukan akuisisi bukti digital, preservasi artefak memori dan disk, analisis reverse engineering kode berbahaya (malware), serta pelacakan jejak intrusion / attack vector.</w:t>
+            </w:r>
+          </w:p>
+        </w:tc>
+      </w:tr>
+      <w:tr>
+        <w:tc>
+          <w:tcPr>
+            <w:tcW w:type="dxa" w:w="3120"/>
+            <w:tcMar>
+              <w:top w:w="60" w:type="dxa"/>
+              <w:bottom w:w="60" w:type="dxa"/>
+              <w:left w:w="80" w:type="dxa"/>
+              <w:right w:w="80" w:type="dxa"/>
+            </w:tcMar>
+          </w:tcPr>
+          <w:p>
+            <w:r>
+              <w:t>5</w:t>
+            </w:r>
+          </w:p>
+        </w:tc>
+        <w:tc>
+          <w:tcPr>
+            <w:tcW w:type="dxa" w:w="3120"/>
+            <w:tcMar>
+              <w:top w:w="60" w:type="dxa"/>
+              <w:bottom w:w="60" w:type="dxa"/>
+              <w:left w:w="80" w:type="dxa"/>
+              <w:right w:w="80" w:type="dxa"/>
+            </w:tcMar>
+          </w:tcPr>
+          <w:p>
+            <w:r>
+              <w:rPr>
+                <w:b/>
+              </w:rPr>
+              <w:t>Tim Penanganan Teknis (System &amp; Network Hardening)</w:t>
+            </w:r>
+          </w:p>
+        </w:tc>
+        <w:tc>
+          <w:tcPr>
+            <w:tcW w:type="dxa" w:w="3120"/>
+            <w:tcMar>
+              <w:top w:w="60" w:type="dxa"/>
+              <w:bottom w:w="60" w:type="dxa"/>
+              <w:left w:w="80" w:type="dxa"/>
+              <w:right w:w="80" w:type="dxa"/>
+            </w:tcMar>
+          </w:tcPr>
+          <w:p>
+            <w:r>
+              <w:t>Melakukan tindakan isolasi server terkompromi (network segmentation), perbaikan celah kerentanan (patching), pemulihan basis data dari backup bersih, dan monitoring pasca-recovery.</w:t>
+            </w:r>
+          </w:p>
+        </w:tc>
+      </w:tr>
+    </w:tbl>
+    <w:p>
+      <w:r>
+        <w:br w:type="page"/>
+      </w:r>
+    </w:p>
+    <w:p>
+      <w:pPr>
+        <w:pStyle w:val="Heading2"/>
+      </w:pPr>
+      <w:r>
+        <w:rPr>
+          <w:color w:val="1F4E79"/>
+        </w:rPr>
+        <w:t>LAMPIRAN II: DOKUMEN PROFIL TIM CSIRT (STANDAR RFC 2350)</w:t>
+      </w:r>
+    </w:p>
+    <w:p>
+      <w:r>
+        <w:t>Dokumen ini mendeskripsikan secara publik profil, wewenang, kebijakan operasional, dan kanal komunikasi resmi Tim CSIRT sesuai standar Internet Engineering Task Force (IETF) RFC 2350 sebagai syarat registrasi BSSN.</w:t>
         <w:br/>
+        <w:br/>
+      </w:r>
+    </w:p>
+    <w:p>
+      <w:pPr>
+        <w:pStyle w:val="Heading3"/>
+      </w:pPr>
+      <w:r>
+        <w:rPr>
+          <w:color w:val="2E75B6"/>
+        </w:rPr>
+        <w:t>1. Informasi Dokumen</w:t>
+      </w:r>
+    </w:p>
+    <w:p>
+      <w:pPr>
+        <w:ind w:left="288"/>
+      </w:pPr>
+      <w:r>
+        <w:t>Versi: 1.0 | Tanggal Rilis: Januari 2026 | Distribusi: Publik (TLP:CLEAR)</w:t>
+      </w:r>
+    </w:p>
+    <w:p>
+      <w:pPr>
+        <w:pStyle w:val="Heading3"/>
+      </w:pPr>
+      <w:r>
+        <w:rPr>
+          <w:color w:val="2E75B6"/>
+        </w:rPr>
+        <w:t>2. Informasi Kontak</w:t>
+      </w:r>
+    </w:p>
+    <w:p>
+      <w:pPr>
+        <w:ind w:left="288"/>
+      </w:pPr>
+      <w:r>
+        <w:t>Nama CSIRT: [NAMA INSTANSI]-CSIRT</w:t>
+        <w:br/>
+        <w:t>Alamat: Gedung Data Center Lt. 2, Jl. Merdeka Siber No. 1</w:t>
+        <w:br/>
+        <w:t>Email: csirt@daerah.go.id | Hotline: 0812-9999-CSIRT (24/7)</w:t>
+        <w:br/>
+        <w:t>Kunci Publik PGP: Key-ID 0x9B4D2F1A, Fingerprint: 4E7A 29BC 11FA 9081 33ED</w:t>
+        <w:br/>
+        <w:t>Zona Waktu: UTC+07:00 (WIB)</w:t>
+      </w:r>
+    </w:p>
+    <w:p>
+      <w:pPr>
+        <w:pStyle w:val="Heading3"/>
+      </w:pPr>
+      <w:r>
+        <w:rPr>
+          <w:color w:val="2E75B6"/>
+        </w:rPr>
+        <w:t>3. Mandat &amp; Konstituen</w:t>
+      </w:r>
+    </w:p>
+    <w:p>
+      <w:pPr>
+        <w:ind w:left="288"/>
+      </w:pPr>
+      <w:r>
+        <w:t>Mandat dibentuk melalui Keputusan Kepala Instansi No. 188.45/120/CSIRT/2026.</w:t>
+        <w:br/>
+        <w:t>Konstituen mencakup seluruh Organisasi Perangkat Daerah (OPD), Unit Pelaksana Teknis, dan pengguna portal layanan publik di lingkungan instansi.</w:t>
+      </w:r>
+    </w:p>
+    <w:p>
+      <w:pPr>
+        <w:pStyle w:val="Heading3"/>
+      </w:pPr>
+      <w:r>
+        <w:rPr>
+          <w:color w:val="2E75B6"/>
+        </w:rPr>
+        <w:t>4. Kebijakan Operasional</w:t>
+      </w:r>
+    </w:p>
+    <w:p>
+      <w:pPr>
+        <w:ind w:left="288"/>
+      </w:pPr>
+      <w:r>
+        <w:t>Menggunakan Traffic Light Protocol (TLP v2.0) untuk klasifikasi pertukaran informasi sensitif.</w:t>
+        <w:br/>
+        <w:t>Bekerja sama erat dengan Pusat Operasi Keamanan Siber Nasional BSSN (Gov-CSIRT).</w:t>
+      </w:r>
+    </w:p>
+    <w:p>
+      <w:pPr>
+        <w:pStyle w:val="Heading3"/>
+      </w:pPr>
+      <w:r>
+        <w:rPr>
+          <w:color w:val="2E75B6"/>
+        </w:rPr>
+        <w:t>5. Layanan CSIRT</w:t>
+      </w:r>
+    </w:p>
+    <w:p>
+      <w:pPr>
+        <w:ind w:left="288"/>
+      </w:pPr>
+      <w:r>
+        <w:t>Layanan Reaktif: Penanganan insiden siber, triase tiket aduan, koordinasi respon darurat, analisis forensik digital.</w:t>
+        <w:br/>
+        <w:t>Layanan Proaktif: Pemindaian kerentanan aplikasi (VAPT), peringatan dini kerentanan (Security Advisory), audit konfigurasi, dan simulasi krisis siber tahunan.</w:t>
       </w:r>
     </w:p>
     <w:sectPr>

</xml_diff>